<commit_message>
Add group member names to all assignment reports and presentations
</commit_message>
<xml_diff>
--- a/Human Computer Interaction Assignment/HCI_Report.docx
+++ b/Human Computer Interaction Assignment/HCI_Report.docx
@@ -172,7 +172,7 @@
           <w:sz w:val="24"/>
           <w:szCs w:val="24"/>
         </w:rPr>
-        <w:t xml:space="preserve">Ahmad Bin Ibrahim (A12345)</w:t>
+        <w:t xml:space="preserve">Al-Aqmar Bin Qaid-E Johar (1121250326560)</w:t>
       </w:r>
     </w:p>
     <w:p>
@@ -187,7 +187,7 @@
           <w:sz w:val="24"/>
           <w:szCs w:val="24"/>
         </w:rPr>
-        <w:t xml:space="preserve">Sarah Binti Abdullah (A12346)</w:t>
+        <w:t xml:space="preserve">Hashem Maged Ali Alhasani (0121250326706)</w:t>
       </w:r>
     </w:p>
     <w:p>
@@ -202,7 +202,7 @@
           <w:sz w:val="24"/>
           <w:szCs w:val="24"/>
         </w:rPr>
-        <w:t xml:space="preserve">Muhammad Hafiz Bin Razak (A12347)</w:t>
+        <w:t xml:space="preserve">Sharjeel Muhammad (0121250326923)</w:t>
       </w:r>
     </w:p>
     <w:p>
@@ -217,7 +217,7 @@
           <w:sz w:val="24"/>
           <w:szCs w:val="24"/>
         </w:rPr>
-        <w:t xml:space="preserve">Nurul Aisyah Binti Hassan (A12348)</w:t>
+        <w:t xml:space="preserve">Abdullah Saleh Abdullah (0121250326783)</w:t>
       </w:r>
     </w:p>
     <w:p>
@@ -232,7 +232,22 @@
           <w:sz w:val="24"/>
           <w:szCs w:val="24"/>
         </w:rPr>
-        <w:t xml:space="preserve">David Tan Wei Ming (A12349)</w:t>
+        <w:t xml:space="preserve">Ateegalla Fadlalseed Ateegalla Ahmed (0121250326810)</w:t>
+      </w:r>
+    </w:p>
+    <w:p>
+      <w:pPr>
+        <w:spacing w:after="40"/>
+        <w:jc w:val="center"/>
+      </w:pPr>
+      <w:r>
+        <w:rPr>
+          <w:rFonts w:ascii="Calibri" w:cs="Calibri" w:eastAsia="Calibri" w:hAnsi="Calibri"/>
+          <w:color w:val="444444"/>
+          <w:sz w:val="24"/>
+          <w:szCs w:val="24"/>
+        </w:rPr>
+        <w:t xml:space="preserve">Ibrahim Muhammad (0121250326708)</w:t>
       </w:r>
     </w:p>
     <w:p>

</xml_diff>